<commit_message>
Correct Fura-2 replicate unit and qualify calcium result
</commit_message>
<xml_diff>
--- a/highlights_Neurochemistry_International.docx
+++ b/highlights_Neurochemistry_International.docx
@@ -15,7 +15,7 @@
         <w:pStyle w:val="ListBullet"/>
       </w:pPr>
       <w:r>
-        <w:t>TDP-43 knockdown reduced a SOCE-associated Ca²⁺ response in SH-SY5Y cells.</w:t>
+        <w:t>One-plate Fura-2 measurements showed a lower Ca²⁺-readdition response after TDP-43 knockdown.</w:t>
       </w:r>
     </w:p>
     <w:p>
@@ -31,7 +31,7 @@
         <w:pStyle w:val="ListBullet"/>
       </w:pPr>
       <w:r>
-        <w:t>No RNA-processing event in the SOCE machinery explained the functional change.</w:t>
+        <w:t>No RNA-processing event in the SOCE machinery explained the observed Fura-2 difference.</w:t>
       </w:r>
     </w:p>
     <w:p>

</xml_diff>

<commit_message>
Correct experimental units and audit RNA-processing and tissue analyses
</commit_message>
<xml_diff>
--- a/highlights_Neurochemistry_International.docx
+++ b/highlights_Neurochemistry_International.docx
@@ -15,7 +15,7 @@
         <w:pStyle w:val="ListBullet"/>
       </w:pPr>
       <w:r>
-        <w:t>One-plate Fura-2 measurements showed a lower Ca²⁺-readdition response after TDP-43 knockdown.</w:t>
+        <w:t>One-plate Fura-2 measurements showed a lower calcium-readdition response.</w:t>
       </w:r>
     </w:p>
     <w:p>
@@ -23,7 +23,7 @@
         <w:pStyle w:val="ListBullet"/>
       </w:pPr>
       <w:r>
-        <w:t>TRPC1, STIM1, ORAI1 and ATP2A3 mRNAs increased after knockdown.</w:t>
+        <w:t>Technical RT-qPCR measurements showed higher calcium-regulatory mRNAs.</w:t>
       </w:r>
     </w:p>
     <w:p>
@@ -31,7 +31,7 @@
         <w:pStyle w:val="ListBullet"/>
       </w:pPr>
       <w:r>
-        <w:t>No RNA-processing event in the SOCE machinery explained the observed Fura-2 difference.</w:t>
+        <w:t>RNA analyses identified candidates without establishing a SOCE mechanism.</w:t>
       </w:r>
     </w:p>
     <w:p>

</xml_diff>